<commit_message>
Agregar evidencias Fase 1
</commit_message>
<xml_diff>
--- a/Fase 1/Evidencias Grupales/1.5_GuiaEstudiante_Fase 1_Definicion Proyecto APT (Español).docx
+++ b/Fase 1/Evidencias Grupales/1.5_GuiaEstudiante_Fase 1_Definicion Proyecto APT (Español).docx
@@ -3500,7 +3500,25 @@
                 <w:szCs w:val="20"/>
                 <w:rtl w:val="0"/>
               </w:rPr>
-              <w:t xml:space="preserve">Entre las principales dificultades se encuentran posibles cambios en los requerimientos, disponibilidad limitada de los usuarios para realizar validaciones, problemas técnicos durante el desarrollo y dificultades de integración entre los módulos. También existen dependencias de servicios y sistemas externos, como BSale, plataformas bancarias y el Servicio de Impuestos Internos (SII), cuya disponibilidad, mecanismos de integración y permisos pueden condicionar determinadas funcionalidades. Para reducir estos riesgos se realizarán validaciones progresivas, priorización mediante Backlog, actualización de las SPEC cuando existan cambios, pruebas continuas y coordinación periódica del equipo. Las funcionalidades que dependan de integraciones externas serán implementadas de acuerdo con la factibilidad técnica y los accesos disponibles durante el desarrollo. </w:t>
+              <w:t xml:space="preserve">Entre las principales dificultades se encuentran posibles cambios en los requerimientos, disponibilidad limitada de los usuarios para realizar validaciones, problemas técnicos durante el desarrollo y dificultades de integración entre los módulos. También existen dependencias de servicios y sistemas externos, como BSale, plataformas bancarias y el Servicio de Impuestos Internos (SII), cuya disponibilidad, mecanismos de integración y permisos pueden condicionar determinadas funcionalidades. Para reducir estos riesgos se realizarán validaciones progresivas, priorización mediante Backlog, actualización de las SPEC cuando existan cambios, pruebas continuas y coordinación periódica del equipo. Las funcionalidades que </w:t>
+            </w:r>
+            <w:r>
+              <w:rPr>
+                <w:rFonts w:ascii="Arial" w:cs="Arial" w:eastAsia="Arial" w:hAnsi="Arial"/>
+                <w:sz w:val="20"/>
+                <w:szCs w:val="20"/>
+                <w:rtl w:val="0"/>
+              </w:rPr>
+              <w:t xml:space="preserve">dependan</w:t>
+            </w:r>
+            <w:r>
+              <w:rPr>
+                <w:rFonts w:ascii="Arial" w:cs="Arial" w:eastAsia="Arial" w:hAnsi="Arial"/>
+                <w:sz w:val="20"/>
+                <w:szCs w:val="20"/>
+                <w:rtl w:val="0"/>
+              </w:rPr>
+              <w:t xml:space="preserve"> de integraciones externas serán implementadas de acuerdo con la factibilidad técnica y los accesos disponibles durante el desarrollo. </w:t>
             </w:r>
             <w:r>
               <w:rPr>
@@ -4234,6 +4252,60 @@
         </w:rPr>
       </w:r>
     </w:p>
+    <w:p>
+      <w:pPr>
+        <w:spacing w:after="0" w:line="360" w:lineRule="auto"/>
+        <w:jc w:val="both"/>
+        <w:rPr>
+          <w:rFonts w:ascii="Arial" w:cs="Arial" w:eastAsia="Arial" w:hAnsi="Arial"/>
+          <w:b w:val="1"/>
+          <w:bCs w:val="1"/>
+          <w:sz w:val="24"/>
+          <w:szCs w:val="24"/>
+        </w:rPr>
+      </w:pPr>
+      <w:r>
+        <w:rPr>
+          <w:rtl w:val="0"/>
+        </w:rPr>
+      </w:r>
+    </w:p>
+    <w:p>
+      <w:pPr>
+        <w:spacing w:after="0" w:line="360" w:lineRule="auto"/>
+        <w:jc w:val="both"/>
+        <w:rPr>
+          <w:rFonts w:ascii="Arial" w:cs="Arial" w:eastAsia="Arial" w:hAnsi="Arial"/>
+          <w:b w:val="1"/>
+          <w:bCs w:val="1"/>
+          <w:sz w:val="24"/>
+          <w:szCs w:val="24"/>
+        </w:rPr>
+      </w:pPr>
+      <w:r>
+        <w:rPr>
+          <w:rtl w:val="0"/>
+        </w:rPr>
+      </w:r>
+    </w:p>
+    <w:p>
+      <w:pPr>
+        <w:spacing w:after="0" w:line="360" w:lineRule="auto"/>
+        <w:jc w:val="both"/>
+        <w:rPr>
+          <w:rFonts w:ascii="Arial" w:cs="Arial" w:eastAsia="Arial" w:hAnsi="Arial"/>
+          <w:b w:val="1"/>
+          <w:bCs w:val="1"/>
+          <w:sz w:val="24"/>
+          <w:szCs w:val="24"/>
+        </w:rPr>
+      </w:pPr>
+      <w:r>
+        <w:rPr>
+          <w:rtl w:val="0"/>
+        </w:rPr>
+      </w:r>
+    </w:p>
     <w:tbl>
       <w:tblPr>
         <w:tblStyle w:val="Table10"/>
@@ -4309,64 +4381,45 @@
                 <w:szCs w:val="20"/>
                 <w:rtl w:val="0"/>
               </w:rPr>
-              <w:t xml:space="preserve">Para el desarrollo de PittySoft se utilizará una metodología híbrida, basada principalmente en Spec-Driven Development (SDD) y complementada con prácticas ágiles de Scrum. Esta elección se adapta a un equipo de tres integrantes que desarrolla paralelamente los módulos POS, SAP-lite y Kuentas dentro del período definido para el proyecto (Delimarsky &amp; Riem, 2026; Schwaber &amp; Sutherland, 2020). </w:t>
-            </w:r>
-          </w:p>
-          <w:p>
-            <w:pPr>
-              <w:jc w:val="both"/>
-              <w:rPr>
-                <w:rFonts w:ascii="Arial" w:cs="Arial" w:eastAsia="Arial" w:hAnsi="Arial"/>
-                <w:sz w:val="20"/>
-                <w:szCs w:val="20"/>
-              </w:rPr>
-            </w:pPr>
-            <w:r>
-              <w:rPr>
-                <w:rFonts w:ascii="Arial" w:cs="Arial" w:eastAsia="Arial" w:hAnsi="Arial"/>
-                <w:sz w:val="20"/>
-                <w:szCs w:val="20"/>
-                <w:rtl w:val="0"/>
-              </w:rPr>
-              <w:t xml:space="preserve">El proceso comenzará con el levantamiento y análisis de requerimientos. A partir de estos se elaborarán especificaciones funcionales (SPEC) que definirán el alcance, comportamiento esperado y criterios de aceptación de las funcionalidades. Posteriormente, estas serán organizadas y priorizadas mediante un Backlog, para avanzar por etapas de diseño, desarrollo, pruebas, validación y corrección.</w:t>
-            </w:r>
-          </w:p>
-          <w:p>
-            <w:pPr>
-              <w:jc w:val="both"/>
-              <w:rPr>
-                <w:rFonts w:ascii="Arial" w:cs="Arial" w:eastAsia="Arial" w:hAnsi="Arial"/>
-                <w:sz w:val="20"/>
-                <w:szCs w:val="20"/>
-              </w:rPr>
-            </w:pPr>
-            <w:r>
-              <w:rPr>
-                <w:rFonts w:ascii="Arial" w:cs="Arial" w:eastAsia="Arial" w:hAnsi="Arial"/>
-                <w:sz w:val="20"/>
-                <w:szCs w:val="20"/>
-                <w:rtl w:val="0"/>
-              </w:rPr>
-              <w:t xml:space="preserve">De Scrum se utilizarán principalmente prácticas de planificación, priorización y revisión periódica del avance, sin implementar necesariamente el marco completo. Esto permitirá mantener un proceso liviano y flexible, mientras SDD proporcionará trazabilidad entre los requerimientos, las especificaciones y las funcionalidades desarrolladas.</w:t>
-            </w:r>
-          </w:p>
-          <w:p>
-            <w:pPr>
-              <w:jc w:val="both"/>
-              <w:rPr>
-                <w:rFonts w:ascii="Arial" w:cs="Arial" w:eastAsia="Arial" w:hAnsi="Arial"/>
-                <w:sz w:val="20"/>
-                <w:szCs w:val="20"/>
-              </w:rPr>
-            </w:pPr>
-            <w:r>
-              <w:rPr>
-                <w:rFonts w:ascii="Arial" w:cs="Arial" w:eastAsia="Arial" w:hAnsi="Arial"/>
-                <w:sz w:val="20"/>
-                <w:szCs w:val="20"/>
-                <w:rtl w:val="0"/>
-              </w:rPr>
-              <w:t xml:space="preserve">El seguimiento del proyecto se apoyará en las SPEC, el Backlog, la Carta Gantt y GitHub, permitiendo controlar el avance de los tres módulos y realizar ajustes cuando se detecten cambios o mejoras durante las pruebas y validaciones.</w:t>
+              <w:t xml:space="preserve">Para el desarrollo de PittySoft se utilizará un enfoque de trabajo que combina prácticas seleccionadas del framework Scrum con Spec-Driven Development (SDD). Scrum se utilizará como marco de referencia para apoyar la gestión y organización del trabajo del equipo, principalmente mediante la planificación, priorización del Backlog y revisión periódica del avance. Debido a las características del proyecto y al tamaño del equipo, no se implementará Scrum en su totalidad ni se adoptarán formalmente todos sus roles, eventos y artefactos (Schwaber &amp; Sutherland, 2020).</w:t>
+            </w:r>
+          </w:p>
+          <w:p>
+            <w:pPr>
+              <w:jc w:val="both"/>
+              <w:rPr>
+                <w:rFonts w:ascii="Arial" w:cs="Arial" w:eastAsia="Arial" w:hAnsi="Arial"/>
+                <w:sz w:val="20"/>
+                <w:szCs w:val="20"/>
+              </w:rPr>
+            </w:pPr>
+            <w:r>
+              <w:rPr>
+                <w:rFonts w:ascii="Arial" w:cs="Arial" w:eastAsia="Arial" w:hAnsi="Arial"/>
+                <w:sz w:val="20"/>
+                <w:szCs w:val="20"/>
+                <w:rtl w:val="0"/>
+              </w:rPr>
+              <w:t xml:space="preserve">Spec-Driven Development (SDD) se utilizará como una práctica complementaria orientada al proceso técnico de desarrollo. Las funcionalidades se definirán mediante especificaciones (SPEC) antes de su implementación, incorporando criterios de aceptación y manteniendo trazabilidad entre los requerimientos, el diseño, las tareas de desarrollo y su posterior validación. De esta manera, SDD complementará las prácticas de gestión utilizadas por el equipo sin sustituir el marco utilizado para organizar el trabajo (Delimarsky &amp; Riem, 2026).</w:t>
+            </w:r>
+          </w:p>
+          <w:p>
+            <w:pPr>
+              <w:jc w:val="both"/>
+              <w:rPr>
+                <w:rFonts w:ascii="Arial" w:cs="Arial" w:eastAsia="Arial" w:hAnsi="Arial"/>
+                <w:sz w:val="20"/>
+                <w:szCs w:val="20"/>
+              </w:rPr>
+            </w:pPr>
+            <w:r>
+              <w:rPr>
+                <w:rFonts w:ascii="Arial" w:cs="Arial" w:eastAsia="Arial" w:hAnsi="Arial"/>
+                <w:sz w:val="20"/>
+                <w:szCs w:val="20"/>
+                <w:rtl w:val="0"/>
+              </w:rPr>
+              <w:t xml:space="preserve">El flujo de trabajo comenzará con el levantamiento y análisis de requerimientos. A partir de estos se elaborarán las especificaciones funcionales (SPEC), en las que se definirán las funcionalidades y sus criterios de aceptación. Posteriormente, el trabajo será organizado y priorizado para continuar con el diseño, implementación, pruebas y validación. Los resultados obtenidos permitirán realizar correcciones y actualizar las especificaciones cuando corresponda.</w:t>
             </w:r>
             <w:r>
               <w:rPr>
@@ -4415,7 +4468,7 @@
         </w:rPr>
         <w:drawing>
           <wp:inline distB="114300" distT="114300" distL="114300" distR="114300">
-            <wp:extent cx="6015871" cy="3984538"/>
+            <wp:extent cx="6057900" cy="3142143"/>
             <wp:effectExtent b="0" l="0" r="0" t="0"/>
             <wp:docPr id="53" name="image3.png"/>
             <a:graphic>
@@ -4427,7 +4480,7 @@
                   </pic:nvPicPr>
                   <pic:blipFill>
                     <a:blip r:embed="rId9"/>
-                    <a:srcRect b="0" l="0" r="0" t="0"/>
+                    <a:srcRect b="11083" l="0" r="0" t="0"/>
                     <a:stretch>
                       <a:fillRect/>
                     </a:stretch>
@@ -4435,7 +4488,7 @@
                   <pic:spPr>
                     <a:xfrm>
                       <a:off x="0" y="0"/>
-                      <a:ext cx="6015871" cy="3984538"/>
+                      <a:ext cx="6057900" cy="3142143"/>
                     </a:xfrm>
                     <a:prstGeom prst="rect"/>
                     <a:ln/>
@@ -4454,13 +4507,11 @@
     </w:p>
     <w:p>
       <w:pPr>
-        <w:spacing w:after="0" w:line="240" w:lineRule="auto"/>
+        <w:spacing w:after="0" w:line="360" w:lineRule="auto"/>
         <w:rPr>
           <w:rFonts w:ascii="Arial" w:cs="Arial" w:eastAsia="Arial" w:hAnsi="Arial"/>
           <w:b w:val="1"/>
           <w:bCs w:val="1"/>
-          <w:sz w:val="24"/>
-          <w:szCs w:val="24"/>
         </w:rPr>
       </w:pPr>
       <w:r>
@@ -4471,7 +4522,7 @@
     </w:p>
     <w:p>
       <w:pPr>
-        <w:spacing w:after="0" w:line="240" w:lineRule="auto"/>
+        <w:spacing w:after="0" w:line="360" w:lineRule="auto"/>
         <w:rPr>
           <w:rFonts w:ascii="Arial" w:cs="Arial" w:eastAsia="Arial" w:hAnsi="Arial"/>
         </w:rPr>
@@ -4490,12 +4541,25 @@
           <w:rFonts w:ascii="Arial" w:cs="Arial" w:eastAsia="Arial" w:hAnsi="Arial"/>
           <w:rtl w:val="0"/>
         </w:rPr>
-        <w:t xml:space="preserve"> Comparación de metodologías de desarrollo de software aplicables a PittySoft.</w:t>
+        <w:t xml:space="preserve"> Comparación de enfoques de trabajo aplicables al desarrollo de PittySoft.</w:t>
       </w:r>
     </w:p>
     <w:p>
       <w:pPr>
-        <w:spacing w:after="0" w:line="240" w:lineRule="auto"/>
+        <w:spacing w:after="0" w:line="360" w:lineRule="auto"/>
+        <w:rPr>
+          <w:rFonts w:ascii="Arial" w:cs="Arial" w:eastAsia="Arial" w:hAnsi="Arial"/>
+        </w:rPr>
+      </w:pPr>
+      <w:r>
+        <w:rPr>
+          <w:rtl w:val="0"/>
+        </w:rPr>
+      </w:r>
+    </w:p>
+    <w:p>
+      <w:pPr>
+        <w:spacing w:after="0" w:line="360" w:lineRule="auto"/>
         <w:rPr>
           <w:rFonts w:ascii="Arial" w:cs="Arial" w:eastAsia="Arial" w:hAnsi="Arial"/>
         </w:rPr>
@@ -4507,25 +4571,32 @@
           <w:bCs w:val="1"/>
           <w:rtl w:val="0"/>
         </w:rPr>
-        <w:t xml:space="preserve">Nota.</w:t>
+        <w:t xml:space="preserve">Nota</w:t>
       </w:r>
       <w:r>
         <w:rPr>
           <w:rFonts w:ascii="Arial" w:cs="Arial" w:eastAsia="Arial" w:hAnsi="Arial"/>
           <w:rtl w:val="0"/>
         </w:rPr>
-        <w:t xml:space="preserve"> Elaboración propia con apoyo de inteligencia artificial a partir del análisis de las metodologías consideradas para el proyecto. </w:t>
+        <w:t xml:space="preserve">. Elaboración propia con apoyo de ChatGPT (OpenAI) para la organización y </w:t>
       </w:r>
     </w:p>
     <w:p>
       <w:pPr>
-        <w:spacing w:after="0" w:line="240" w:lineRule="auto"/>
+        <w:spacing w:after="0" w:line="360" w:lineRule="auto"/>
         <w:rPr>
           <w:rFonts w:ascii="Arial" w:cs="Arial" w:eastAsia="Arial" w:hAnsi="Arial"/>
           <w:b w:val="1"/>
           <w:bCs w:val="1"/>
         </w:rPr>
       </w:pPr>
+      <w:r>
+        <w:rPr>
+          <w:rFonts w:ascii="Arial" w:cs="Arial" w:eastAsia="Arial" w:hAnsi="Arial"/>
+          <w:rtl w:val="0"/>
+        </w:rPr>
+        <w:t xml:space="preserve">síntesis comparativa de la información. El contenido fue revisado y adaptado por el equipo a partir de las fuentes oficiales consultadas sobre Scrum y Spec-Driven Development (Delimarsky &amp; Riem, 2026; Schwaber &amp; Sutherland, 2020).</w:t>
+      </w:r>
       <w:r>
         <w:rPr>
           <w:rtl w:val="0"/>
@@ -4534,11 +4605,9 @@
     </w:p>
     <w:p>
       <w:pPr>
-        <w:spacing w:after="0" w:line="240" w:lineRule="auto"/>
+        <w:spacing w:after="240" w:before="240" w:line="360" w:lineRule="auto"/>
         <w:rPr>
           <w:rFonts w:ascii="Arial" w:cs="Arial" w:eastAsia="Arial" w:hAnsi="Arial"/>
-          <w:b w:val="1"/>
-          <w:bCs w:val="1"/>
         </w:rPr>
       </w:pPr>
       <w:r>
@@ -4549,11 +4618,19 @@
           <w:rtl w:val="0"/>
         </w:rPr>
         <w:t xml:space="preserve">Justificación de la metodología seleccionada:</w:t>
+        <w:br w:type="textWrapping"/>
+      </w:r>
+      <w:r>
+        <w:rPr>
+          <w:rFonts w:ascii="Arial" w:cs="Arial" w:eastAsia="Arial" w:hAnsi="Arial"/>
+          <w:rtl w:val="0"/>
+        </w:rPr>
+        <w:t xml:space="preserve">A partir del análisis realizado, se determinó utilizar prácticas seleccionadas del framework Scrum en conjunto con Spec-Driven Development (SDD), considerando que ambos cumplen funciones diferentes dentro del desarrollo de PittySoft. Scrum se utiliza como marco de referencia para apoyar la gestión y organización del trabajo mediante la planificación, priorización del Backlog y revisión periódica del avance, sin implementar formalmente la totalidad de sus roles, eventos y artefactos.</w:t>
       </w:r>
     </w:p>
     <w:p>
       <w:pPr>
-        <w:spacing w:after="0" w:line="240" w:lineRule="auto"/>
+        <w:spacing w:after="240" w:before="240" w:line="360" w:lineRule="auto"/>
         <w:rPr>
           <w:rFonts w:ascii="Arial" w:cs="Arial" w:eastAsia="Arial" w:hAnsi="Arial"/>
         </w:rPr>
@@ -4563,7 +4640,152 @@
           <w:rFonts w:ascii="Arial" w:cs="Arial" w:eastAsia="Arial" w:hAnsi="Arial"/>
           <w:rtl w:val="0"/>
         </w:rPr>
-        <w:t xml:space="preserve">A partir de la comparación realizada, se determinó utilizar un enfoque híbrido basado principalmente en Spec-Driven Development (SDD) y complementado con prácticas ágiles de Scrum. SDD se adapta al proyecto debido al uso de especificaciones funcionales (SPEC) para definir y mantener la trazabilidad de las funcionalidades, mientras que Scrum aporta prácticas de planificación, priorización mediante Backlog y revisión periódica del avance. Esta combinación permite mantener una metodología liviana y flexible, adecuada para un equipo de tres integrantes y para el desarrollo paralelo de los módulos POS, SAP-lite y Kuentas (Delimarsky &amp; Riem, 2026; Schwaber &amp; Sutherland, 2020). </w:t>
+        <w:t xml:space="preserve">Por su parte, SDD se incorpora como una práctica complementaria orientada al proceso técnico de desarrollo, permitiendo definir las funcionalidades mediante especificaciones (SPEC) antes de su implementación y mantener trazabilidad entre los requerimientos, el desarrollo y su posterior validación. Esta combinación permite organizar el trabajo de un equipo de tres integrantes y, al mismo tiempo, mantener especificaciones claras para el desarrollo paralelo de los módulos POS, SAP-lite y Kuentas (Delimarsky &amp; Riem, 2026; Schwaber &amp; Sutherland, 2020).</w:t>
+      </w:r>
+    </w:p>
+    <w:p>
+      <w:pPr>
+        <w:spacing w:after="0" w:line="360" w:lineRule="auto"/>
+        <w:rPr>
+          <w:rFonts w:ascii="Arial" w:cs="Arial" w:eastAsia="Arial" w:hAnsi="Arial"/>
+        </w:rPr>
+      </w:pPr>
+      <w:r>
+        <w:rPr>
+          <w:rtl w:val="0"/>
+        </w:rPr>
+      </w:r>
+    </w:p>
+    <w:p>
+      <w:pPr>
+        <w:spacing w:after="0" w:line="360" w:lineRule="auto"/>
+        <w:rPr>
+          <w:rFonts w:ascii="Arial" w:cs="Arial" w:eastAsia="Arial" w:hAnsi="Arial"/>
+          <w:b w:val="1"/>
+          <w:bCs w:val="1"/>
+        </w:rPr>
+      </w:pPr>
+      <w:r>
+        <w:rPr>
+          <w:rtl w:val="0"/>
+        </w:rPr>
+      </w:r>
+    </w:p>
+    <w:p>
+      <w:pPr>
+        <w:spacing w:after="0" w:line="360" w:lineRule="auto"/>
+        <w:rPr>
+          <w:rFonts w:ascii="Arial" w:cs="Arial" w:eastAsia="Arial" w:hAnsi="Arial"/>
+        </w:rPr>
+      </w:pPr>
+      <w:r>
+        <w:rPr>
+          <w:rFonts w:ascii="Arial" w:cs="Arial" w:eastAsia="Arial" w:hAnsi="Arial"/>
+          <w:b w:val="1"/>
+          <w:bCs w:val="1"/>
+          <w:rtl w:val="0"/>
+        </w:rPr>
+        <w:t xml:space="preserve">Artefactos de trabajo</w:t>
+      </w:r>
+      <w:r>
+        <w:rPr>
+          <w:rtl w:val="0"/>
+        </w:rPr>
+      </w:r>
+    </w:p>
+    <w:p>
+      <w:pPr>
+        <w:spacing w:after="0" w:line="360" w:lineRule="auto"/>
+        <w:rPr>
+          <w:rFonts w:ascii="Arial" w:cs="Arial" w:eastAsia="Arial" w:hAnsi="Arial"/>
+        </w:rPr>
+      </w:pPr>
+      <w:r>
+        <w:rPr>
+          <w:rFonts w:ascii="Arial" w:cs="Arial" w:eastAsia="Arial" w:hAnsi="Arial"/>
+          <w:rtl w:val="0"/>
+        </w:rPr>
+        <w:t xml:space="preserve">Para apoyar la aplicación del enfoque de trabajo seleccionado, el equipo utiliza distintos artefactos durante el desarrollo de PittySoft. Las especificaciones funcionales (SPEC) permiten documentar el alcance, comportamiento esperado y criterios de aceptación de las funcionalidades antes de su implementación. El Backlog del proyecto permite organizar y priorizar el trabajo derivado de los requerimientos y las SPEC, mientras que la Carta Gantt permite representar la planificación temporal del proyecto. Adicionalmente, se generan evidencias de pruebas y validación para registrar los resultados obtenidos y las incidencias o mejoras identificadas durante el desarrollo. GitHub se utiliza como herramienta de apoyo para el control de versiones, registro de cambios y seguimiento técnico del proyecto.</w:t>
+      </w:r>
+    </w:p>
+    <w:p>
+      <w:pPr>
+        <w:spacing w:after="0" w:line="360" w:lineRule="auto"/>
+        <w:rPr>
+          <w:rFonts w:ascii="Arial" w:cs="Arial" w:eastAsia="Arial" w:hAnsi="Arial"/>
+          <w:b w:val="1"/>
+          <w:bCs w:val="1"/>
+        </w:rPr>
+      </w:pPr>
+      <w:r>
+        <w:rPr>
+          <w:rtl w:val="0"/>
+        </w:rPr>
+      </w:r>
+    </w:p>
+    <w:p>
+      <w:pPr>
+        <w:spacing w:after="0" w:line="360" w:lineRule="auto"/>
+        <w:rPr>
+          <w:rFonts w:ascii="Arial" w:cs="Arial" w:eastAsia="Arial" w:hAnsi="Arial"/>
+        </w:rPr>
+      </w:pPr>
+      <w:r>
+        <w:rPr>
+          <w:rFonts w:ascii="Arial" w:cs="Arial" w:eastAsia="Arial" w:hAnsi="Arial"/>
+          <w:b w:val="1"/>
+          <w:bCs w:val="1"/>
+          <w:rtl w:val="0"/>
+        </w:rPr>
+        <w:t xml:space="preserve">Roles y responsabilidades</w:t>
+      </w:r>
+      <w:r>
+        <w:rPr>
+          <w:rtl w:val="0"/>
+        </w:rPr>
+      </w:r>
+    </w:p>
+    <w:p>
+      <w:pPr>
+        <w:spacing w:after="0" w:line="360" w:lineRule="auto"/>
+        <w:rPr>
+          <w:rFonts w:ascii="Arial" w:cs="Arial" w:eastAsia="Arial" w:hAnsi="Arial"/>
+        </w:rPr>
+      </w:pPr>
+      <w:r>
+        <w:rPr>
+          <w:rFonts w:ascii="Arial" w:cs="Arial" w:eastAsia="Arial" w:hAnsi="Arial"/>
+          <w:rtl w:val="0"/>
+        </w:rPr>
+        <w:t xml:space="preserve">Las responsabilidades del equipo se distribuyen principalmente de acuerdo con los módulos que componen PittySoft. Gabriel Bermar es responsable principalmente del módulo Kuentas, asociado a los procesos contables y tributarios; Axel Blanlot es responsable principalmente del módulo POS, relacionado con los procesos de atención, clientes y Punto de Venta; y Sebastian Quezada es responsable principalmente del módulo SAP-lite, orientado a proveedores, facturas de compra, movimientos financieros y Control de Gestión. Las actividades transversales, como el levantamiento de requerimientos, integración, pruebas, validación y documentación, son desarrolladas colaborativamente por los tres integrantes según las necesidades del proyecto.</w:t>
+      </w:r>
+    </w:p>
+    <w:p>
+      <w:pPr>
+        <w:spacing w:after="0" w:line="360" w:lineRule="auto"/>
+        <w:rPr>
+          <w:rFonts w:ascii="Arial" w:cs="Arial" w:eastAsia="Arial" w:hAnsi="Arial"/>
+        </w:rPr>
+      </w:pPr>
+      <w:r>
+        <w:rPr>
+          <w:rtl w:val="0"/>
+        </w:rPr>
+      </w:r>
+    </w:p>
+    <w:p>
+      <w:pPr>
+        <w:spacing w:after="0" w:line="360" w:lineRule="auto"/>
+        <w:rPr>
+          <w:rFonts w:ascii="Arial" w:cs="Arial" w:eastAsia="Arial" w:hAnsi="Arial"/>
+        </w:rPr>
+      </w:pPr>
+      <w:r>
+        <w:rPr>
+          <w:rFonts w:ascii="Arial" w:cs="Arial" w:eastAsia="Arial" w:hAnsi="Arial"/>
+          <w:rtl w:val="0"/>
+        </w:rPr>
+        <w:t xml:space="preserve">Debido a que PittySoft utiliza prácticas seleccionadas de Scrum y no implementa el framework en su totalidad, el equipo no adopta formalmente todos los roles definidos por Scrum. La distribución de responsabilidades se adapta a la estructura del proyecto y a los módulos asignados, manteniendo el trabajo colaborativo para los elementos comunes de la solución (Schwaber &amp; Sutherland, 2020).</w:t>
       </w:r>
     </w:p>
     <w:p>
@@ -6107,8 +6329,6 @@
       <w:r>
         <w:rPr>
           <w:rFonts w:ascii="Arial" w:cs="Arial" w:eastAsia="Arial" w:hAnsi="Arial"/>
-          <w:b w:val="1"/>
-          <w:bCs w:val="1"/>
           <w:sz w:val="24"/>
           <w:szCs w:val="24"/>
           <w:rtl w:val="0"/>
@@ -6283,41 +6503,36 @@
     <w:p>
       <w:pPr>
         <w:spacing w:after="0" w:line="360" w:lineRule="auto"/>
-        <w:jc w:val="center"/>
         <w:rPr>
           <w:rFonts w:ascii="Arial" w:cs="Arial" w:eastAsia="Arial" w:hAnsi="Arial"/>
-          <w:b w:val="1"/>
-          <w:bCs w:val="1"/>
         </w:rPr>
       </w:pPr>
       <w:r>
         <w:rPr>
+          <w:rFonts w:ascii="Arial" w:cs="Arial" w:eastAsia="Arial" w:hAnsi="Arial"/>
           <w:rtl w:val="0"/>
         </w:rPr>
+        <w:t xml:space="preserve">La Estructura de Desglose del Trabajo (EDT/WBS) de PittySoft representa una descomposición jerárquica del alcance del Proyecto APT orientada a entregables. Su estructura considera como entregables principales la documentación del proyecto, los módulos POS, SAP-lite y Kuentas, la solución PittySoft integrada y validada, y los entregables finales del Proyecto APT. Cada uno de estos elementos se descompone en entregables de menor nivel que permiten representar de manera organizada los resultados que deberá producir el proyecto (Project Management Institute, 2019).</w:t>
       </w:r>
     </w:p>
     <w:p>
       <w:pPr>
-        <w:spacing w:after="240" w:line="360" w:lineRule="auto"/>
+        <w:spacing w:after="0" w:line="360" w:lineRule="auto"/>
         <w:rPr>
           <w:rFonts w:ascii="Arial" w:cs="Arial" w:eastAsia="Arial" w:hAnsi="Arial"/>
         </w:rPr>
       </w:pPr>
       <w:r>
         <w:rPr>
-          <w:rFonts w:ascii="Arial" w:cs="Arial" w:eastAsia="Arial" w:hAnsi="Arial"/>
           <w:rtl w:val="0"/>
         </w:rPr>
-        <w:t xml:space="preserve">La Estructura de Desglose del Trabajo (EDT/WBS) de PittySoft organiza el proyecto en los principales paquetes de trabajo necesarios para alcanzar los objetivos definidos. Su estructura considera los tres módulos principales de la solución —POS, SAP-lite y Kuentas— junto con las actividades transversales necesarias para gestionar, integrar, probar y finalizar el proyecto (Project Management Institute, 2019). </w:t>
       </w:r>
     </w:p>
     <w:p>
       <w:pPr>
-        <w:spacing w:after="240" w:before="240" w:line="360" w:lineRule="auto"/>
+        <w:spacing w:after="0" w:line="360" w:lineRule="auto"/>
         <w:rPr>
           <w:rFonts w:ascii="Arial" w:cs="Arial" w:eastAsia="Arial" w:hAnsi="Arial"/>
-          <w:b w:val="1"/>
-          <w:bCs w:val="1"/>
         </w:rPr>
       </w:pPr>
       <w:r>
@@ -6325,12 +6540,7 @@
           <w:rFonts w:ascii="Arial" w:cs="Arial" w:eastAsia="Arial" w:hAnsi="Arial"/>
           <w:rtl w:val="0"/>
         </w:rPr>
-        <w:t xml:space="preserve">La EDT permite descomponer el proyecto en componentes más pequeños y manejables, facilitando la asignación de responsabilidades, la planificación de actividades y el seguimiento del avance. A partir de esta estructura se relacionarán posteriormente las actividades del Plan de Trabajo, el Backlog y la Carta Gantt.</w:t>
-      </w:r>
-      <w:r>
-        <w:rPr>
-          <w:rtl w:val="0"/>
-        </w:rPr>
+        <w:t xml:space="preserve">Esta estructura permite delimitar y organizar el alcance sin representar fases ni una secuencia temporal de ejecución. Las actividades necesarias para producir cada entregable, así como su duración y distribución en el tiempo, se establecen posteriormente mediante el Plan de Trabajo, el Backlog y la Carta Gantt.</w:t>
       </w:r>
     </w:p>
     <w:p>
@@ -6355,14 +6565,14 @@
         </w:rPr>
         <w:drawing>
           <wp:inline distB="114300" distT="114300" distL="114300" distR="114300">
-            <wp:extent cx="5399730" cy="3657600"/>
+            <wp:extent cx="5399730" cy="3403600"/>
             <wp:effectExtent b="0" l="0" r="0" t="0"/>
-            <wp:docPr id="51" name="image2.png"/>
+            <wp:docPr id="51" name="image2.jpg"/>
             <a:graphic>
               <a:graphicData uri="http://schemas.openxmlformats.org/drawingml/2006/picture">
                 <pic:pic>
                   <pic:nvPicPr>
-                    <pic:cNvPr id="0" name="image2.png"/>
+                    <pic:cNvPr id="0" name="image2.jpg"/>
                     <pic:cNvPicPr preferRelativeResize="0"/>
                   </pic:nvPicPr>
                   <pic:blipFill>
@@ -6375,7 +6585,7 @@
                   <pic:spPr>
                     <a:xfrm>
                       <a:off x="0" y="0"/>
-                      <a:ext cx="5399730" cy="3657600"/>
+                      <a:ext cx="5399730" cy="3403600"/>
                     </a:xfrm>
                     <a:prstGeom prst="rect"/>
                     <a:ln/>
@@ -6413,7 +6623,7 @@
           <w:rFonts w:ascii="Arial" w:cs="Arial" w:eastAsia="Arial" w:hAnsi="Arial"/>
           <w:rtl w:val="0"/>
         </w:rPr>
-        <w:t xml:space="preserve"> Estructura de Desglose del Trabajo (EDT/WBS) del Proyecto APT – PittySoft.</w:t>
+        <w:t xml:space="preserve"> Estructura de Desglose del Trabajo (EDT/WBS) orientada a entregables del Proyecto APT – PittySoft.</w:t>
       </w:r>
     </w:p>
     <w:p>
@@ -6421,14 +6631,30 @@
         <w:spacing w:after="0" w:line="360" w:lineRule="auto"/>
         <w:rPr>
           <w:rFonts w:ascii="Arial" w:cs="Arial" w:eastAsia="Arial" w:hAnsi="Arial"/>
+          <w:b w:val="1"/>
+          <w:bCs w:val="1"/>
         </w:rPr>
       </w:pPr>
       <w:r>
         <w:rPr>
           <w:rFonts w:ascii="Arial" w:cs="Arial" w:eastAsia="Arial" w:hAnsi="Arial"/>
+          <w:b w:val="1"/>
+          <w:bCs w:val="1"/>
           <w:rtl w:val="0"/>
         </w:rPr>
-        <w:t xml:space="preserve">Nota. Elaboración propia a partir del alcance y planificación del proyecto. </w:t>
+        <w:t xml:space="preserve">Nota.</w:t>
+      </w:r>
+      <w:r>
+        <w:rPr>
+          <w:rFonts w:ascii="Arial" w:cs="Arial" w:eastAsia="Arial" w:hAnsi="Arial"/>
+          <w:rtl w:val="0"/>
+        </w:rPr>
+        <w:t xml:space="preserve"> Elaboración propia con apoyo de ChatGPT (OpenAI) para la estructuración inicial de la EDT/WBS. La estructura fue revisada y adaptada por el equipo de acuerdo con el alcance definido para PittySoft y los principios de descomposición del trabajo del Project Management Institute (2019). </w:t>
+      </w:r>
+      <w:r>
+        <w:rPr>
+          <w:rtl w:val="0"/>
+        </w:rPr>
       </w:r>
     </w:p>
     <w:p>

</xml_diff>